<commit_message>
make some changes to baocao
</commit_message>
<xml_diff>
--- a/CT239H-Guideline.docx
+++ b/CT239H-Guideline.docx
@@ -1136,84 +1136,13 @@
         <w:t xml:space="preserve">3.1. </w:t>
       </w:r>
       <w:r>
-        <w:t>Software Requirement Specification</w:t>
-      </w:r>
-    </w:p>
-    <w:p>
-      <w:pPr>
-        <w:pStyle w:val="Heading4"/>
-        <w:spacing w:before="120" w:after="0" w:line="288" w:lineRule="auto"/>
-        <w:ind w:leftChars="117" w:left="284" w:hanging="3"/>
-        <w:rPr>
-          <w:rFonts w:cs="Times New Roman"/>
-          <w:szCs w:val="26"/>
-        </w:rPr>
-      </w:pPr>
-      <w:r>
-        <w:rPr>
-          <w:rFonts w:cs="Times New Roman"/>
-          <w:szCs w:val="26"/>
-        </w:rPr>
-        <w:t xml:space="preserve">3.1.1. </w:t>
-      </w:r>
-      <w:r>
-        <w:rPr>
-          <w:rFonts w:cs="Times New Roman"/>
-          <w:szCs w:val="26"/>
-        </w:rPr>
-        <w:t>Overall Description</w:t>
-      </w:r>
-    </w:p>
-    <w:p>
-      <w:pPr>
-        <w:spacing w:before="120" w:after="0" w:line="288" w:lineRule="auto"/>
-        <w:ind w:left="357"/>
-        <w:jc w:val="both"/>
-        <w:rPr>
-          <w:rFonts w:ascii="Times New Roman" w:hAnsi="Times New Roman" w:cs="Times New Roman"/>
-          <w:sz w:val="26"/>
-          <w:szCs w:val="26"/>
-        </w:rPr>
-      </w:pPr>
-    </w:p>
-    <w:p>
-      <w:pPr>
-        <w:pStyle w:val="Heading4"/>
-        <w:spacing w:before="120" w:after="0" w:line="288" w:lineRule="auto"/>
-        <w:ind w:leftChars="117" w:left="284" w:hanging="3"/>
-        <w:rPr>
-          <w:rFonts w:cs="Times New Roman"/>
-          <w:szCs w:val="26"/>
-        </w:rPr>
-      </w:pPr>
-      <w:r>
-        <w:rPr>
-          <w:rFonts w:cs="Times New Roman"/>
-          <w:szCs w:val="26"/>
-        </w:rPr>
-        <w:t xml:space="preserve">3.1.2. </w:t>
-      </w:r>
-      <w:r>
-        <w:rPr>
-          <w:rFonts w:cs="Times New Roman"/>
-          <w:szCs w:val="26"/>
-        </w:rPr>
-        <w:t>Specific Requirements</w:t>
-      </w:r>
-    </w:p>
-    <w:p>
-      <w:pPr>
-        <w:spacing w:before="120" w:after="0" w:line="288" w:lineRule="auto"/>
-        <w:ind w:left="357"/>
-        <w:jc w:val="both"/>
-        <w:rPr>
-          <w:rFonts w:ascii="Times New Roman" w:hAnsi="Times New Roman" w:cs="Times New Roman"/>
-          <w:sz w:val="26"/>
-          <w:szCs w:val="26"/>
-        </w:rPr>
-      </w:pPr>
+        <w:t>Software Requirement Specific</w:t>
+      </w:r>
       <w:bookmarkStart w:id="0" w:name="_GoBack"/>
       <w:bookmarkEnd w:id="0"/>
+      <w:r>
+        <w:t>ation</w:t>
+      </w:r>
     </w:p>
     <w:p>
       <w:pPr>
@@ -1230,6 +1159,80 @@
           <w:rFonts w:cs="Times New Roman"/>
           <w:szCs w:val="26"/>
         </w:rPr>
+        <w:t xml:space="preserve">3.1.1. </w:t>
+      </w:r>
+      <w:r>
+        <w:rPr>
+          <w:rFonts w:cs="Times New Roman"/>
+          <w:szCs w:val="26"/>
+        </w:rPr>
+        <w:t>Overall Description</w:t>
+      </w:r>
+    </w:p>
+    <w:p>
+      <w:pPr>
+        <w:spacing w:before="120" w:after="0" w:line="288" w:lineRule="auto"/>
+        <w:ind w:left="357"/>
+        <w:jc w:val="both"/>
+        <w:rPr>
+          <w:rFonts w:ascii="Times New Roman" w:hAnsi="Times New Roman" w:cs="Times New Roman"/>
+          <w:sz w:val="26"/>
+          <w:szCs w:val="26"/>
+        </w:rPr>
+      </w:pPr>
+    </w:p>
+    <w:p>
+      <w:pPr>
+        <w:pStyle w:val="Heading4"/>
+        <w:spacing w:before="120" w:after="0" w:line="288" w:lineRule="auto"/>
+        <w:ind w:leftChars="117" w:left="284" w:hanging="3"/>
+        <w:rPr>
+          <w:rFonts w:cs="Times New Roman"/>
+          <w:szCs w:val="26"/>
+        </w:rPr>
+      </w:pPr>
+      <w:r>
+        <w:rPr>
+          <w:rFonts w:cs="Times New Roman"/>
+          <w:szCs w:val="26"/>
+        </w:rPr>
+        <w:t xml:space="preserve">3.1.2. </w:t>
+      </w:r>
+      <w:r>
+        <w:rPr>
+          <w:rFonts w:cs="Times New Roman"/>
+          <w:szCs w:val="26"/>
+        </w:rPr>
+        <w:t>Specific Requirements</w:t>
+      </w:r>
+    </w:p>
+    <w:p>
+      <w:pPr>
+        <w:spacing w:before="120" w:after="0" w:line="288" w:lineRule="auto"/>
+        <w:ind w:left="357"/>
+        <w:jc w:val="both"/>
+        <w:rPr>
+          <w:rFonts w:ascii="Times New Roman" w:hAnsi="Times New Roman" w:cs="Times New Roman"/>
+          <w:sz w:val="26"/>
+          <w:szCs w:val="26"/>
+        </w:rPr>
+      </w:pPr>
+    </w:p>
+    <w:p>
+      <w:pPr>
+        <w:pStyle w:val="Heading4"/>
+        <w:spacing w:before="120" w:after="0" w:line="288" w:lineRule="auto"/>
+        <w:ind w:leftChars="117" w:left="284" w:hanging="3"/>
+        <w:rPr>
+          <w:rFonts w:cs="Times New Roman"/>
+          <w:szCs w:val="26"/>
+        </w:rPr>
+      </w:pPr>
+      <w:r>
+        <w:rPr>
+          <w:rFonts w:cs="Times New Roman"/>
+          <w:szCs w:val="26"/>
+        </w:rPr>
         <w:t xml:space="preserve">3.1.3. </w:t>
       </w:r>
       <w:r>
@@ -1511,7 +1514,21 @@
           <w:rFonts w:cs="Times New Roman"/>
           <w:szCs w:val="26"/>
         </w:rPr>
-        <w:t>1. BFD -&gt; 2. DFD -&gt; 3. CLASS DIAGRAM -&gt; 4. ACTIVITY DIAGRAM + GIẢI THÍCH LOGIC BRANCH &amp; BOUND</w:t>
+        <w:t>1. BFD -&gt; 2. DFD -&gt; 3. CL</w:t>
+      </w:r>
+      <w:r>
+        <w:rPr>
+          <w:rFonts w:cs="Times New Roman"/>
+          <w:szCs w:val="26"/>
+        </w:rPr>
+        <w:t>x`</w:t>
+      </w:r>
+      <w:r>
+        <w:rPr>
+          <w:rFonts w:cs="Times New Roman"/>
+          <w:szCs w:val="26"/>
+        </w:rPr>
+        <w:t>ASS DIAGRAM -&gt; 4. ACTIVITY DIAGRAM + GIẢI THÍCH LOGIC BRANCH &amp; BOUND</w:t>
       </w:r>
       <w:r>
         <w:rPr>
@@ -2445,6 +2462,95 @@
     </w:lvl>
   </w:abstractNum>
   <w:abstractNum w:abstractNumId="2" w15:restartNumberingAfterBreak="0">
+    <w:nsid w:val="3E1208CF"/>
+    <w:multiLevelType w:val="hybridMultilevel"/>
+    <w:tmpl w:val="4DB0D3DE"/>
+    <w:lvl w:ilvl="0" w:tplc="54D00BC2">
+      <w:start w:val="1"/>
+      <w:numFmt w:val="upperRoman"/>
+      <w:lvlText w:val="%1."/>
+      <w:lvlJc w:val="left"/>
+      <w:pPr>
+        <w:ind w:left="1080" w:hanging="720"/>
+      </w:pPr>
+      <w:rPr>
+        <w:rFonts w:hint="default"/>
+      </w:rPr>
+    </w:lvl>
+    <w:lvl w:ilvl="1" w:tplc="04090019" w:tentative="1">
+      <w:start w:val="1"/>
+      <w:numFmt w:val="lowerLetter"/>
+      <w:lvlText w:val="%2."/>
+      <w:lvlJc w:val="left"/>
+      <w:pPr>
+        <w:ind w:left="1440" w:hanging="360"/>
+      </w:pPr>
+    </w:lvl>
+    <w:lvl w:ilvl="2" w:tplc="0409001B" w:tentative="1">
+      <w:start w:val="1"/>
+      <w:numFmt w:val="lowerRoman"/>
+      <w:lvlText w:val="%3."/>
+      <w:lvlJc w:val="right"/>
+      <w:pPr>
+        <w:ind w:left="2160" w:hanging="180"/>
+      </w:pPr>
+    </w:lvl>
+    <w:lvl w:ilvl="3" w:tplc="0409000F" w:tentative="1">
+      <w:start w:val="1"/>
+      <w:numFmt w:val="decimal"/>
+      <w:lvlText w:val="%4."/>
+      <w:lvlJc w:val="left"/>
+      <w:pPr>
+        <w:ind w:left="2880" w:hanging="360"/>
+      </w:pPr>
+    </w:lvl>
+    <w:lvl w:ilvl="4" w:tplc="04090019" w:tentative="1">
+      <w:start w:val="1"/>
+      <w:numFmt w:val="lowerLetter"/>
+      <w:lvlText w:val="%5."/>
+      <w:lvlJc w:val="left"/>
+      <w:pPr>
+        <w:ind w:left="3600" w:hanging="360"/>
+      </w:pPr>
+    </w:lvl>
+    <w:lvl w:ilvl="5" w:tplc="0409001B" w:tentative="1">
+      <w:start w:val="1"/>
+      <w:numFmt w:val="lowerRoman"/>
+      <w:lvlText w:val="%6."/>
+      <w:lvlJc w:val="right"/>
+      <w:pPr>
+        <w:ind w:left="4320" w:hanging="180"/>
+      </w:pPr>
+    </w:lvl>
+    <w:lvl w:ilvl="6" w:tplc="0409000F" w:tentative="1">
+      <w:start w:val="1"/>
+      <w:numFmt w:val="decimal"/>
+      <w:lvlText w:val="%7."/>
+      <w:lvlJc w:val="left"/>
+      <w:pPr>
+        <w:ind w:left="5040" w:hanging="360"/>
+      </w:pPr>
+    </w:lvl>
+    <w:lvl w:ilvl="7" w:tplc="04090019" w:tentative="1">
+      <w:start w:val="1"/>
+      <w:numFmt w:val="lowerLetter"/>
+      <w:lvlText w:val="%8."/>
+      <w:lvlJc w:val="left"/>
+      <w:pPr>
+        <w:ind w:left="5760" w:hanging="360"/>
+      </w:pPr>
+    </w:lvl>
+    <w:lvl w:ilvl="8" w:tplc="0409001B" w:tentative="1">
+      <w:start w:val="1"/>
+      <w:numFmt w:val="lowerRoman"/>
+      <w:lvlText w:val="%9."/>
+      <w:lvlJc w:val="right"/>
+      <w:pPr>
+        <w:ind w:left="6480" w:hanging="180"/>
+      </w:pPr>
+    </w:lvl>
+  </w:abstractNum>
+  <w:abstractNum w:abstractNumId="3" w15:restartNumberingAfterBreak="0">
     <w:nsid w:val="4FDD1E88"/>
     <w:multiLevelType w:val="multilevel"/>
     <w:tmpl w:val="DFEC10D8"/>
@@ -2593,7 +2699,7 @@
       </w:rPr>
     </w:lvl>
   </w:abstractNum>
-  <w:abstractNum w:abstractNumId="3" w15:restartNumberingAfterBreak="0">
+  <w:abstractNum w:abstractNumId="4" w15:restartNumberingAfterBreak="0">
     <w:nsid w:val="5B1A4C4E"/>
     <w:multiLevelType w:val="hybridMultilevel"/>
     <w:tmpl w:val="D438E0D0"/>
@@ -2682,7 +2788,7 @@
       </w:pPr>
     </w:lvl>
   </w:abstractNum>
-  <w:abstractNum w:abstractNumId="4" w15:restartNumberingAfterBreak="0">
+  <w:abstractNum w:abstractNumId="5" w15:restartNumberingAfterBreak="0">
     <w:nsid w:val="669B0E38"/>
     <w:multiLevelType w:val="multilevel"/>
     <w:tmpl w:val="77D25396"/>
@@ -2831,7 +2937,7 @@
       </w:rPr>
     </w:lvl>
   </w:abstractNum>
-  <w:abstractNum w:abstractNumId="5" w15:restartNumberingAfterBreak="0">
+  <w:abstractNum w:abstractNumId="6" w15:restartNumberingAfterBreak="0">
     <w:nsid w:val="750D5740"/>
     <w:multiLevelType w:val="multilevel"/>
     <w:tmpl w:val="DADCC3CA"/>
@@ -2980,7 +3086,7 @@
       </w:rPr>
     </w:lvl>
   </w:abstractNum>
-  <w:abstractNum w:abstractNumId="6" w15:restartNumberingAfterBreak="0">
+  <w:abstractNum w:abstractNumId="7" w15:restartNumberingAfterBreak="0">
     <w:nsid w:val="7CAD5C46"/>
     <w:multiLevelType w:val="multilevel"/>
     <w:tmpl w:val="8572C85C"/>
@@ -3130,13 +3236,13 @@
     </w:lvl>
   </w:abstractNum>
   <w:num w:numId="1">
-    <w:abstractNumId w:val="2"/>
+    <w:abstractNumId w:val="3"/>
   </w:num>
   <w:num w:numId="2">
-    <w:abstractNumId w:val="5"/>
+    <w:abstractNumId w:val="6"/>
   </w:num>
   <w:num w:numId="3">
-    <w:abstractNumId w:val="6"/>
+    <w:abstractNumId w:val="7"/>
   </w:num>
   <w:num w:numId="4">
     <w:abstractNumId w:val="0"/>
@@ -3145,10 +3251,13 @@
     <w:abstractNumId w:val="1"/>
   </w:num>
   <w:num w:numId="6">
+    <w:abstractNumId w:val="5"/>
+  </w:num>
+  <w:num w:numId="7">
     <w:abstractNumId w:val="4"/>
   </w:num>
-  <w:num w:numId="7">
-    <w:abstractNumId w:val="3"/>
+  <w:num w:numId="8">
+    <w:abstractNumId w:val="2"/>
   </w:num>
 </w:numbering>
 </file>

</xml_diff>